<commit_message>
Rewrite site copy in Ryan's voice; correct Patient Preferred facts; add Beyond the code
Adapted from Ryan's own rjrjensen.github.io profile.

Co-Authored-By: Claude Opus 5.5 <noreply@anthropic.com>
</commit_message>
<xml_diff>
--- a/apps/web/public/downloads/base/Ryan Jensen - Resume.docx
+++ b/apps/web/public/downloads/base/Ryan Jensen - Resume.docx
@@ -53,7 +53,7 @@
         </w:rPr>
         <w:t xml:space="preserve"> · </w:t>
       </w:r>
-      <w:hyperlink w:history="1" r:id="rIdgushusjw4ouhd7ep8ollt">
+      <w:hyperlink w:history="1" r:id="rIdhs8m7glpljgspixixo4c2">
         <w:r>
           <w:rPr>
             <w:color w:val="1F3A5F"/>
@@ -67,7 +67,7 @@
         </w:rPr>
         <w:t xml:space="preserve"> · </w:t>
       </w:r>
-      <w:hyperlink w:history="1" r:id="rIdlwm9uoqri4nl_b98_ygho">
+      <w:hyperlink w:history="1" r:id="rId1k3qcmiwgyjuhaxisbbtb">
         <w:r>
           <w:rPr>
             <w:color w:val="1F3A5F"/>
@@ -81,7 +81,7 @@
         </w:rPr>
         <w:t xml:space="preserve"> · </w:t>
       </w:r>
-      <w:hyperlink w:history="1" r:id="rId3tdw-tpylp4_pceepyk2m">
+      <w:hyperlink w:history="1" r:id="rIde08ubvowatoovxrub1iwm">
         <w:r>
           <w:rPr>
             <w:color w:val="1F3A5F"/>
@@ -971,7 +971,7 @@
         <w:spacing w:after="40" w:before="0"/>
       </w:pPr>
       <w:r>
-        <w:t xml:space="preserve">The company's sole technology owner, reporting directly to leadership. Own technology strategy and roadmap, budget and vendor selection, and security and compliance. Partner closely with teams at the company's software vendors, including DataX, ACHeck, and Web.com.</w:t>
+        <w:t xml:space="preserve">The company's sole developer and IT person for its clinic payment and patient management platform, inherited from a larger development team. Report directly to leadership and own technology strategy and roadmap, budget and vendor selection, and security and compliance. Partner closely with teams at the company's software vendors, including DataX, ACHeck, and Web.com.</w:t>
       </w:r>
     </w:p>
     <w:p>
@@ -984,7 +984,7 @@
         <w:spacing w:after="20"/>
       </w:pPr>
       <w:r>
-        <w:t xml:space="preserve">Architected the next phase of the company's systems from the ground up: migrated the frontend from AngularJS to React, and the backend from an ASP.NET API to an ASP.NET Core API with satellite serverless modules, all moved off Windows VMs in AWS. The entire system now runs on AWS serverless products, lowering costs by ~75% and maximizing scalability.</w:t>
+        <w:t xml:space="preserve">Cut monthly AWS costs ~91%, from ~$1,400 to ~$120, over three years of incremental modernization with Terraform, CloudFront path-based routing, and right-sized infrastructure, while improving availability, stability, and speed.</w:t>
       </w:r>
     </w:p>
     <w:p>
@@ -997,7 +997,7 @@
         <w:spacing w:after="20"/>
       </w:pPr>
       <w:r>
-        <w:t xml:space="preserve">Implemented solutions that minimize cost and automate repetitive tasks.</w:t>
+        <w:t xml:space="preserve">Modernized the platform from an AngularJS frontend and .NET Framework 4.5 API on Windows Server 2012 EC2 instances to React on AWS Amplify and a .NET 10 Minimal API on Elastic Beanstalk, with SQL Server moved to RDS and SQL Agent jobs replaced by EventBridge-triggered Lambda functions.</w:t>
       </w:r>
     </w:p>
     <w:p>
@@ -1010,7 +1010,20 @@
         <w:spacing w:after="20"/>
       </w:pPr>
       <w:r>
-        <w:t xml:space="preserve">Integrated third-party software offerings with resiliency and fallback plans for critical processes.</w:t>
+        <w:t xml:space="preserve">Integrated third-party software offerings with resiliency and fallback plans for critical processes, including ACH payment processing.</w:t>
+      </w:r>
+    </w:p>
+    <w:p>
+      <w:pPr>
+        <w:pStyle w:val="ListParagraph"/>
+        <w:numPr>
+          <w:ilvl w:val="0"/>
+          <w:numId w:val="2"/>
+        </w:numPr>
+        <w:spacing w:after="20"/>
+      </w:pPr>
+      <w:r>
+        <w:t xml:space="preserve">Handle everything from patient onboarding and document signing to customer support and keeping the lights on.</w:t>
       </w:r>
     </w:p>
     <w:p>
@@ -1032,7 +1045,7 @@
           <w:sz w:val="18"/>
           <w:szCs w:val="18"/>
         </w:rPr>
-        <w:t xml:space="preserve">.NET Framework → modern .NET, AngularJS → React, Microsoft SQL Server → PostgreSQL, AWS Serverless, Terraform</w:t>
+        <w:t xml:space="preserve">.NET Framework 4.5 → .NET 10, AngularJS → React, AWS Amplify, Elastic Beanstalk, RDS for SQL Server, EventBridge + Lambda, CloudFront, Terraform</w:t>
       </w:r>
     </w:p>
     <w:p>

</xml_diff>

<commit_message>
Add skills from Ryan's profile, Marbles live link, Patient Preferred PostgreSQL/serverless progress
- Complete and Lead versions gain Data and Build & Testing categories plus
  languages, frameworks, AWS services, Ansible, and Linux (cron)
- Skills and highlight text can now be limited or reworded per version
- Manager resume keeps a shorter Patient Preferred bullet to stay on two pages

Co-Authored-By: Claude Opus 5.5 <noreply@anthropic.com>
</commit_message>
<xml_diff>
--- a/apps/web/public/downloads/base/Ryan Jensen - Resume.docx
+++ b/apps/web/public/downloads/base/Ryan Jensen - Resume.docx
@@ -53,7 +53,7 @@
         </w:rPr>
         <w:t xml:space="preserve"> · </w:t>
       </w:r>
-      <w:hyperlink w:history="1" r:id="rIdhs8m7glpljgspixixo4c2">
+      <w:hyperlink w:history="1" r:id="rIdgoja5lhaavsiucfhvtgvq">
         <w:r>
           <w:rPr>
             <w:color w:val="1F3A5F"/>
@@ -67,7 +67,7 @@
         </w:rPr>
         <w:t xml:space="preserve"> · </w:t>
       </w:r>
-      <w:hyperlink w:history="1" r:id="rId1k3qcmiwgyjuhaxisbbtb">
+      <w:hyperlink w:history="1" r:id="rIdt9nz7ctrwrexmqbumxphq">
         <w:r>
           <w:rPr>
             <w:color w:val="1F3A5F"/>
@@ -81,7 +81,7 @@
         </w:rPr>
         <w:t xml:space="preserve"> · </w:t>
       </w:r>
-      <w:hyperlink w:history="1" r:id="rIde08ubvowatoovxrub1iwm">
+      <w:hyperlink w:history="1" r:id="rId5ag2a9pkwwiujgqp6bnd6">
         <w:r>
           <w:rPr>
             <w:color w:val="1F3A5F"/>
@@ -195,6 +195,46 @@
         </w:rPr>
         <w:t xml:space="preserve">Python</w:t>
       </w:r>
+      <w:r>
+        <w:t xml:space="preserve">, </w:t>
+      </w:r>
+      <w:r>
+        <w:rPr>
+          <w:b w:val="false"/>
+          <w:bCs w:val="false"/>
+        </w:rPr>
+        <w:t xml:space="preserve">HTML</w:t>
+      </w:r>
+      <w:r>
+        <w:t xml:space="preserve">, </w:t>
+      </w:r>
+      <w:r>
+        <w:rPr>
+          <w:b w:val="false"/>
+          <w:bCs w:val="false"/>
+        </w:rPr>
+        <w:t xml:space="preserve">CSS / Sass / Less</w:t>
+      </w:r>
+      <w:r>
+        <w:t xml:space="preserve">, </w:t>
+      </w:r>
+      <w:r>
+        <w:rPr>
+          <w:b w:val="false"/>
+          <w:bCs w:val="false"/>
+        </w:rPr>
+        <w:t xml:space="preserve">Bash</w:t>
+      </w:r>
+      <w:r>
+        <w:t xml:space="preserve">, </w:t>
+      </w:r>
+      <w:r>
+        <w:rPr>
+          <w:b w:val="false"/>
+          <w:bCs w:val="false"/>
+        </w:rPr>
+        <w:t xml:space="preserve">PowerShell</w:t>
+      </w:r>
     </w:p>
     <w:p>
       <w:pPr>
@@ -264,6 +304,26 @@
         </w:rPr>
         <w:t xml:space="preserve">Node.js</w:t>
       </w:r>
+      <w:r>
+        <w:t xml:space="preserve">, </w:t>
+      </w:r>
+      <w:r>
+        <w:rPr>
+          <w:b w:val="false"/>
+          <w:bCs w:val="false"/>
+        </w:rPr>
+        <w:t xml:space="preserve">Express</w:t>
+      </w:r>
+      <w:r>
+        <w:t xml:space="preserve">, </w:t>
+      </w:r>
+      <w:r>
+        <w:rPr>
+          <w:b w:val="false"/>
+          <w:bCs w:val="false"/>
+        </w:rPr>
+        <w:t xml:space="preserve">Apollo GraphQL</w:t>
+      </w:r>
     </w:p>
     <w:p>
       <w:pPr>
@@ -343,6 +403,56 @@
         </w:rPr>
         <w:t xml:space="preserve">Vue.js</w:t>
       </w:r>
+      <w:r>
+        <w:t xml:space="preserve">, </w:t>
+      </w:r>
+      <w:r>
+        <w:rPr>
+          <w:b w:val="false"/>
+          <w:bCs w:val="false"/>
+        </w:rPr>
+        <w:t xml:space="preserve">AngularJS</w:t>
+      </w:r>
+      <w:r>
+        <w:t xml:space="preserve">, </w:t>
+      </w:r>
+      <w:r>
+        <w:rPr>
+          <w:b w:val="false"/>
+          <w:bCs w:val="false"/>
+        </w:rPr>
+        <w:t xml:space="preserve">jQuery</w:t>
+      </w:r>
+      <w:r>
+        <w:t xml:space="preserve">, </w:t>
+      </w:r>
+      <w:r>
+        <w:rPr>
+          <w:b w:val="false"/>
+          <w:bCs w:val="false"/>
+        </w:rPr>
+        <w:t xml:space="preserve">RxJS</w:t>
+      </w:r>
+      <w:r>
+        <w:t xml:space="preserve">, </w:t>
+      </w:r>
+      <w:r>
+        <w:rPr>
+          <w:b w:val="false"/>
+          <w:bCs w:val="false"/>
+        </w:rPr>
+        <w:t xml:space="preserve">HTMX</w:t>
+      </w:r>
+      <w:r>
+        <w:t xml:space="preserve">, </w:t>
+      </w:r>
+      <w:r>
+        <w:rPr>
+          <w:b w:val="false"/>
+          <w:bCs w:val="false"/>
+        </w:rPr>
+        <w:t xml:space="preserve">Material UI</w:t>
+      </w:r>
     </w:p>
     <w:p>
       <w:pPr>
@@ -412,6 +522,26 @@
         </w:rPr>
         <w:t xml:space="preserve">Terraform</w:t>
       </w:r>
+      <w:r>
+        <w:t xml:space="preserve">, </w:t>
+      </w:r>
+      <w:r>
+        <w:rPr>
+          <w:b w:val="false"/>
+          <w:bCs w:val="false"/>
+        </w:rPr>
+        <w:t xml:space="preserve">Ansible</w:t>
+      </w:r>
+      <w:r>
+        <w:t xml:space="preserve">, </w:t>
+      </w:r>
+      <w:r>
+        <w:rPr>
+          <w:b w:val="false"/>
+          <w:bCs w:val="false"/>
+        </w:rPr>
+        <w:t xml:space="preserve">Linux (cron)</w:t>
+      </w:r>
     </w:p>
     <w:p>
       <w:pPr>
@@ -520,6 +650,164 @@
           <w:b/>
           <w:bCs/>
         </w:rPr>
+        <w:t xml:space="preserve">Data: </w:t>
+      </w:r>
+      <w:r>
+        <w:rPr>
+          <w:b w:val="false"/>
+          <w:bCs w:val="false"/>
+        </w:rPr>
+        <w:t xml:space="preserve">SQL Server</w:t>
+      </w:r>
+      <w:r>
+        <w:t xml:space="preserve">, </w:t>
+      </w:r>
+      <w:r>
+        <w:rPr>
+          <w:b w:val="false"/>
+          <w:bCs w:val="false"/>
+        </w:rPr>
+        <w:t xml:space="preserve">PostgreSQL</w:t>
+      </w:r>
+      <w:r>
+        <w:t xml:space="preserve">, </w:t>
+      </w:r>
+      <w:r>
+        <w:rPr>
+          <w:b w:val="false"/>
+          <w:bCs w:val="false"/>
+        </w:rPr>
+        <w:t xml:space="preserve">MySQL</w:t>
+      </w:r>
+      <w:r>
+        <w:t xml:space="preserve">, </w:t>
+      </w:r>
+      <w:r>
+        <w:rPr>
+          <w:b w:val="false"/>
+          <w:bCs w:val="false"/>
+        </w:rPr>
+        <w:t xml:space="preserve">SQLite</w:t>
+      </w:r>
+      <w:r>
+        <w:t xml:space="preserve">, </w:t>
+      </w:r>
+      <w:r>
+        <w:rPr>
+          <w:b w:val="false"/>
+          <w:bCs w:val="false"/>
+        </w:rPr>
+        <w:t xml:space="preserve">MongoDB</w:t>
+      </w:r>
+      <w:r>
+        <w:t xml:space="preserve">, </w:t>
+      </w:r>
+      <w:r>
+        <w:rPr>
+          <w:b w:val="false"/>
+          <w:bCs w:val="false"/>
+        </w:rPr>
+        <w:t xml:space="preserve">Redis</w:t>
+      </w:r>
+      <w:r>
+        <w:t xml:space="preserve">, </w:t>
+      </w:r>
+      <w:r>
+        <w:rPr>
+          <w:b w:val="false"/>
+          <w:bCs w:val="false"/>
+        </w:rPr>
+        <w:t xml:space="preserve">Elasticsearch</w:t>
+      </w:r>
+    </w:p>
+    <w:p>
+      <w:pPr>
+        <w:spacing w:after="20"/>
+      </w:pPr>
+      <w:r>
+        <w:rPr>
+          <w:b/>
+          <w:bCs/>
+        </w:rPr>
+        <w:t xml:space="preserve">Build &amp; Testing: </w:t>
+      </w:r>
+      <w:r>
+        <w:rPr>
+          <w:b w:val="false"/>
+          <w:bCs w:val="false"/>
+        </w:rPr>
+        <w:t xml:space="preserve">Gradle</w:t>
+      </w:r>
+      <w:r>
+        <w:t xml:space="preserve">, </w:t>
+      </w:r>
+      <w:r>
+        <w:rPr>
+          <w:b w:val="false"/>
+          <w:bCs w:val="false"/>
+        </w:rPr>
+        <w:t xml:space="preserve">Maven</w:t>
+      </w:r>
+      <w:r>
+        <w:t xml:space="preserve">, </w:t>
+      </w:r>
+      <w:r>
+        <w:rPr>
+          <w:b w:val="false"/>
+          <w:bCs w:val="false"/>
+        </w:rPr>
+        <w:t xml:space="preserve">Yarn</w:t>
+      </w:r>
+      <w:r>
+        <w:t xml:space="preserve">, </w:t>
+      </w:r>
+      <w:r>
+        <w:rPr>
+          <w:b w:val="false"/>
+          <w:bCs w:val="false"/>
+        </w:rPr>
+        <w:t xml:space="preserve">Webpack</w:t>
+      </w:r>
+      <w:r>
+        <w:t xml:space="preserve">, </w:t>
+      </w:r>
+      <w:r>
+        <w:rPr>
+          <w:b w:val="false"/>
+          <w:bCs w:val="false"/>
+        </w:rPr>
+        <w:t xml:space="preserve">Cypress</w:t>
+      </w:r>
+      <w:r>
+        <w:t xml:space="preserve">, </w:t>
+      </w:r>
+      <w:r>
+        <w:rPr>
+          <w:b w:val="false"/>
+          <w:bCs w:val="false"/>
+        </w:rPr>
+        <w:t xml:space="preserve">Selenium</w:t>
+      </w:r>
+      <w:r>
+        <w:t xml:space="preserve">, </w:t>
+      </w:r>
+      <w:r>
+        <w:rPr>
+          <w:b w:val="false"/>
+          <w:bCs w:val="false"/>
+        </w:rPr>
+        <w:t xml:space="preserve">Gherkin</w:t>
+      </w:r>
+    </w:p>
+    <w:p>
+      <w:pPr>
+        <w:spacing w:after="20"/>
+      </w:pPr>
+      <w:r>
+        <w:rPr>
+          <w:b/>
+          <w:bCs/>
+        </w:rPr>
         <w:t xml:space="preserve">Tooling: </w:t>
       </w:r>
       <w:r>
@@ -559,6 +847,36 @@
         </w:rPr>
         <w:t xml:space="preserve">dbt</w:t>
       </w:r>
+      <w:r>
+        <w:t xml:space="preserve">, </w:t>
+      </w:r>
+      <w:r>
+        <w:rPr>
+          <w:b w:val="false"/>
+          <w:bCs w:val="false"/>
+        </w:rPr>
+        <w:t xml:space="preserve">Eclipse</w:t>
+      </w:r>
+      <w:r>
+        <w:t xml:space="preserve">, </w:t>
+      </w:r>
+      <w:r>
+        <w:rPr>
+          <w:b w:val="false"/>
+          <w:bCs w:val="false"/>
+        </w:rPr>
+        <w:t xml:space="preserve">Postman</w:t>
+      </w:r>
+      <w:r>
+        <w:t xml:space="preserve">, </w:t>
+      </w:r>
+      <w:r>
+        <w:rPr>
+          <w:b w:val="false"/>
+          <w:bCs w:val="false"/>
+        </w:rPr>
+        <w:t xml:space="preserve">Figma</w:t>
+      </w:r>
     </w:p>
     <w:p>
       <w:pPr>
@@ -597,6 +915,86 @@
           <w:bCs w:val="false"/>
         </w:rPr>
         <w:t xml:space="preserve">Google Cloud</w:t>
+      </w:r>
+      <w:r>
+        <w:t xml:space="preserve">, </w:t>
+      </w:r>
+      <w:r>
+        <w:rPr>
+          <w:b w:val="false"/>
+          <w:bCs w:val="false"/>
+        </w:rPr>
+        <w:t xml:space="preserve">AWS Lambda</w:t>
+      </w:r>
+      <w:r>
+        <w:t xml:space="preserve">, </w:t>
+      </w:r>
+      <w:r>
+        <w:rPr>
+          <w:b w:val="false"/>
+          <w:bCs w:val="false"/>
+        </w:rPr>
+        <w:t xml:space="preserve">EC2</w:t>
+      </w:r>
+      <w:r>
+        <w:t xml:space="preserve">, </w:t>
+      </w:r>
+      <w:r>
+        <w:rPr>
+          <w:b w:val="false"/>
+          <w:bCs w:val="false"/>
+        </w:rPr>
+        <w:t xml:space="preserve">S3</w:t>
+      </w:r>
+      <w:r>
+        <w:t xml:space="preserve">, </w:t>
+      </w:r>
+      <w:r>
+        <w:rPr>
+          <w:b w:val="false"/>
+          <w:bCs w:val="false"/>
+        </w:rPr>
+        <w:t xml:space="preserve">RDS</w:t>
+      </w:r>
+      <w:r>
+        <w:t xml:space="preserve">, </w:t>
+      </w:r>
+      <w:r>
+        <w:rPr>
+          <w:b w:val="false"/>
+          <w:bCs w:val="false"/>
+        </w:rPr>
+        <w:t xml:space="preserve">CloudFront</w:t>
+      </w:r>
+      <w:r>
+        <w:t xml:space="preserve">, </w:t>
+      </w:r>
+      <w:r>
+        <w:rPr>
+          <w:b w:val="false"/>
+          <w:bCs w:val="false"/>
+        </w:rPr>
+        <w:t xml:space="preserve">Amplify</w:t>
+      </w:r>
+      <w:r>
+        <w:t xml:space="preserve">, </w:t>
+      </w:r>
+      <w:r>
+        <w:rPr>
+          <w:b w:val="false"/>
+          <w:bCs w:val="false"/>
+        </w:rPr>
+        <w:t xml:space="preserve">Elastic Beanstalk</w:t>
+      </w:r>
+      <w:r>
+        <w:t xml:space="preserve">, </w:t>
+      </w:r>
+      <w:r>
+        <w:rPr>
+          <w:b w:val="false"/>
+          <w:bCs w:val="false"/>
+        </w:rPr>
+        <w:t xml:space="preserve">EventBridge</w:t>
       </w:r>
     </w:p>
     <w:p>
@@ -997,7 +1395,7 @@
         <w:spacing w:after="20"/>
       </w:pPr>
       <w:r>
-        <w:t xml:space="preserve">Modernized the platform from an AngularJS frontend and .NET Framework 4.5 API on Windows Server 2012 EC2 instances to React on AWS Amplify and a .NET 10 Minimal API on Elastic Beanstalk, with SQL Server moved to RDS and SQL Agent jobs replaced by EventBridge-triggered Lambda functions.</w:t>
+        <w:t xml:space="preserve">Modernized the platform from an AngularJS frontend and .NET Framework 4.5 API on Windows Server 2012 EC2 instances to React on AWS Amplify and a .NET 10 Minimal API on Elastic Beanstalk, with SQL Server moved to RDS and SQL Agent jobs replaced by EventBridge-triggered Lambda functions and cron jobs on a small Linux instance. Now migrating the database to PostgreSQL and moving the platform toward serverless.</w:t>
       </w:r>
     </w:p>
     <w:p>
@@ -1045,7 +1443,7 @@
           <w:sz w:val="18"/>
           <w:szCs w:val="18"/>
         </w:rPr>
-        <w:t xml:space="preserve">.NET Framework 4.5 → .NET 10, AngularJS → React, AWS Amplify, Elastic Beanstalk, RDS for SQL Server, EventBridge + Lambda, CloudFront, Terraform</w:t>
+        <w:t xml:space="preserve">.NET Framework 4.5 → .NET 10, AngularJS → React, SQL Server → PostgreSQL (in progress), AWS Amplify, Elastic Beanstalk, RDS, EventBridge + Lambda, Linux (cron), CloudFront, Terraform</w:t>
       </w:r>
     </w:p>
     <w:p>

</xml_diff>

<commit_message>
Tighten every experience block so all resume versions fit on two pages
- Rewrote summaries and bullets to lead with outcomes, folding tool lists
  into Technologies lines and dropping repeated or filler sentences
- Removed the per-version cuts the Manager resume needed to fit
- Build now fails on text truncated by YAML (e.g. an unquoted ' #')

Co-Authored-By: Claude Opus 5.5 <noreply@anthropic.com>
</commit_message>
<xml_diff>
--- a/apps/web/public/downloads/base/Ryan Jensen - Resume.docx
+++ b/apps/web/public/downloads/base/Ryan Jensen - Resume.docx
@@ -53,7 +53,7 @@
         </w:rPr>
         <w:t xml:space="preserve"> · </w:t>
       </w:r>
-      <w:hyperlink w:history="1" r:id="rIdggeypzvm9mqdqacn10fbl">
+      <w:hyperlink w:history="1" r:id="rIdpqez37im-ot1uaz4mihbc">
         <w:r>
           <w:rPr>
             <w:color w:val="1F3A5F"/>
@@ -67,7 +67,7 @@
         </w:rPr>
         <w:t xml:space="preserve"> · </w:t>
       </w:r>
-      <w:hyperlink w:history="1" r:id="rId4d3krsilwjztn2dkxmpwj">
+      <w:hyperlink w:history="1" r:id="rIdtpk-y2zctwuz_crpvu6oj">
         <w:r>
           <w:rPr>
             <w:color w:val="1F3A5F"/>
@@ -81,7 +81,7 @@
         </w:rPr>
         <w:t xml:space="preserve"> · </w:t>
       </w:r>
-      <w:hyperlink w:history="1" r:id="rIdzervviy9iv_rein5zo5kz">
+      <w:hyperlink w:history="1" r:id="rIdy-kt3-nwc91sgbjgb3cal">
         <w:r>
           <w:rPr>
             <w:color w:val="1F3A5F"/>
@@ -1181,7 +1181,7 @@
         <w:spacing w:after="40" w:before="0"/>
       </w:pPr>
       <w:r>
-        <w:t xml:space="preserve">Delivered software consulting across 4+ client engagements spanning financial services, insurance, identity management, and enterprise web platforms. Work covered full-stack development, technical delivery leadership, coaching, and generative AI.</w:t>
+        <w:t xml:space="preserve">Consultant across 4+ client engagements in financial services, insurance, identity management, and enterprise web, spanning full-stack development, delivery leadership, coaching, and generative AI.</w:t>
       </w:r>
     </w:p>
     <w:p>
@@ -1194,7 +1194,7 @@
         <w:spacing w:after="20"/>
       </w:pPr>
       <w:r>
-        <w:t xml:space="preserve">Led internationalization of a client's customer-facing portal and outgoing email system, adding full English/French support using Vue I18n and Thymeleaf on a Vue.js frontend and Java/Spring Boot backend, covering both web pages and email layouts.</w:t>
+        <w:t xml:space="preserve">Ranked #1 interviewer for 2025 and the first half of 2026, with 30+ interviews and ~10 hires still with the company.</w:t>
       </w:r>
     </w:p>
     <w:p>
@@ -1207,7 +1207,7 @@
         <w:spacing w:after="20"/>
       </w:pPr>
       <w:r>
-        <w:t xml:space="preserve">Reworked the frontend of a high-traffic identity-management application, one of the client's most performant systems.</w:t>
+        <w:t xml:space="preserve">Technical delivery lead for a data engineering engagement (SQL Server, Databricks, dbt), including project management and coaching.</w:t>
       </w:r>
     </w:p>
     <w:p>
@@ -1220,7 +1220,7 @@
         <w:spacing w:after="20"/>
       </w:pPr>
       <w:r>
-        <w:t xml:space="preserve">Bootstrapped a generative AI initiative using AWS Bedrock, Python, and Node.js.</w:t>
+        <w:t xml:space="preserve">Led English/French internationalization of a client's customer portal and outgoing email (Vue I18n, Thymeleaf, Spring Boot).</w:t>
       </w:r>
     </w:p>
     <w:p>
@@ -1233,7 +1233,7 @@
         <w:spacing w:after="20"/>
       </w:pPr>
       <w:r>
-        <w:t xml:space="preserve">Served as technical delivery lead on a data engineering engagement using SQL Server, Databricks, and dbt, with project management and coaching responsibilities.</w:t>
+        <w:t xml:space="preserve">Bootstrapped a generative AI initiative on AWS Bedrock.</w:t>
       </w:r>
     </w:p>
     <w:p>
@@ -1246,7 +1246,7 @@
         <w:spacing w:after="20"/>
       </w:pPr>
       <w:r>
-        <w:t xml:space="preserve">Contributed across engagements as needed in delivery, strategy development, product management, UX/UI, and business analysis.</w:t>
+        <w:t xml:space="preserve">Reworked the frontend of a high-traffic identity-management application.</w:t>
       </w:r>
     </w:p>
     <w:p>
@@ -1259,7 +1259,84 @@
         <w:spacing w:after="20"/>
       </w:pPr>
       <w:r>
-        <w:t xml:space="preserve">Ranked #1 interviewer at Source Allies for 2025 and the first half of 2026. Interviewed 30+ candidates; about 10 were hired and are still with the company.</w:t>
+        <w:t xml:space="preserve">Mentor and teach the company's apprentices.</w:t>
+      </w:r>
+    </w:p>
+    <w:p>
+      <w:pPr>
+        <w:spacing w:after="0" w:before="40"/>
+      </w:pPr>
+      <w:r>
+        <w:rPr>
+          <w:b/>
+          <w:bCs/>
+          <w:sz w:val="18"/>
+          <w:szCs w:val="18"/>
+        </w:rPr>
+        <w:t xml:space="preserve">Technologies: </w:t>
+      </w:r>
+      <w:r>
+        <w:rPr>
+          <w:color w:val="555555"/>
+          <w:sz w:val="18"/>
+          <w:szCs w:val="18"/>
+        </w:rPr>
+        <w:t xml:space="preserve">Vue.js, React, Java, Spring Boot, GraphQL, C#, TypeScript, Python, Node.js, AWS Bedrock, Azure, SQL Server, Databricks, dbt</w:t>
+      </w:r>
+    </w:p>
+    <w:p>
+      <w:pPr>
+        <w:keepNext/>
+        <w:tabs>
+          <w:tab w:val="right" w:pos="10512"/>
+        </w:tabs>
+        <w:spacing w:after="0" w:before="110"/>
+      </w:pPr>
+      <w:r>
+        <w:rPr>
+          <w:b/>
+          <w:bCs/>
+        </w:rPr>
+        <w:t xml:space="preserve">Fractional CTO</w:t>
+      </w:r>
+      <w:r>
+        <w:rPr>
+          <w:b/>
+          <w:bCs/>
+          <w:color w:val="1F3A5F"/>
+        </w:rPr>
+        <w:t xml:space="preserve">  |  Patient Preferred Financial Services</w:t>
+      </w:r>
+      <w:r>
+        <w:rPr>
+          <w:color w:val="555555"/>
+        </w:rPr>
+        <w:tab/>
+        <w:t xml:space="preserve">November 2021 – Present</w:t>
+      </w:r>
+    </w:p>
+    <w:p>
+      <w:pPr>
+        <w:keepNext/>
+        <w:spacing w:after="40"/>
+      </w:pPr>
+      <w:r>
+        <w:rPr>
+          <w:i/>
+          <w:iCs/>
+          <w:color w:val="555555"/>
+          <w:sz w:val="18"/>
+          <w:szCs w:val="18"/>
+        </w:rPr>
+        <w:t xml:space="preserve">Remote</w:t>
+      </w:r>
+    </w:p>
+    <w:p>
+      <w:pPr>
+        <w:spacing w:after="40" w:before="0"/>
+      </w:pPr>
+      <w:r>
+        <w:t xml:space="preserve">Took over a clinic payment and patient-management platform from a larger development team and run it solo, reporting to leadership. Own technology strategy, budget, vendor relationships (DataX, ACHeck, Web.com), and security and compliance.</w:t>
       </w:r>
     </w:p>
     <w:p>
@@ -1272,7 +1349,33 @@
         <w:spacing w:after="20"/>
       </w:pPr>
       <w:r>
-        <w:t xml:space="preserve">Mentored and taught the company's apprentices.</w:t>
+        <w:t xml:space="preserve">Cut monthly AWS costs ~91% (~$1,400 → ~$120) over three years while improving availability, stability, and speed.</w:t>
+      </w:r>
+    </w:p>
+    <w:p>
+      <w:pPr>
+        <w:pStyle w:val="ListParagraph"/>
+        <w:numPr>
+          <w:ilvl w:val="0"/>
+          <w:numId w:val="2"/>
+        </w:numPr>
+        <w:spacing w:after="20"/>
+      </w:pPr>
+      <w:r>
+        <w:t xml:space="preserve">Modernized the platform from an AngularJS frontend, .NET Framework API, and SQL Server with SQL Jobs on Windows Server 2012 EC2 instances to SSR Next.js on AWS via OpenNext, modern .NET Minimal APIs on AWS Lambda, PostgreSQL on AWS RDS, and crontab on a nano Linux instance.</w:t>
+      </w:r>
+    </w:p>
+    <w:p>
+      <w:pPr>
+        <w:pStyle w:val="ListParagraph"/>
+        <w:numPr>
+          <w:ilvl w:val="0"/>
+          <w:numId w:val="2"/>
+        </w:numPr>
+        <w:spacing w:after="20"/>
+      </w:pPr>
+      <w:r>
+        <w:t xml:space="preserve">Built resiliency and fallback plans into critical third-party integrations, including ACH payments.</w:t>
       </w:r>
     </w:p>
     <w:p>
@@ -1294,7 +1397,22 @@
           <w:sz w:val="18"/>
           <w:szCs w:val="18"/>
         </w:rPr>
-        <w:t xml:space="preserve">Vue.js, React, Java, Spring Boot, GraphQL, C#, TypeScript, Python, Node.js, AWS, AWS Bedrock, Azure, SQL Server, Databricks, dbt</w:t>
+        <w:t xml:space="preserve">.NET Framework 4.5 → .NET 10, AngularJS → Next.js, SQL Server → PostgreSQL, EC2 → CloudFront + Lambda + OpenNext, SQL Jobs → Linux (crontab), Terraform</w:t>
+      </w:r>
+    </w:p>
+    <w:p>
+      <w:pPr>
+        <w:spacing w:after="0" w:before="20"/>
+      </w:pPr>
+      <w:r>
+        <w:rPr>
+          <w:i/>
+          <w:iCs/>
+          <w:color w:val="555555"/>
+          <w:sz w:val="18"/>
+          <w:szCs w:val="18"/>
+        </w:rPr>
+        <w:t xml:space="preserve">Currently part-time, supporting new feature requests and regular software updates.</w:t>
       </w:r>
     </w:p>
     <w:p>
@@ -1310,7 +1428,7 @@
           <w:b/>
           <w:bCs/>
         </w:rPr>
-        <w:t xml:space="preserve">Fractional CTO</w:t>
+        <w:t xml:space="preserve">Contract Senior Software Engineer</w:t>
       </w:r>
       <w:r>
         <w:rPr>
@@ -1318,14 +1436,14 @@
           <w:bCs/>
           <w:color w:val="1F3A5F"/>
         </w:rPr>
-        <w:t xml:space="preserve">  |  Patient Preferred Financial Services</w:t>
+        <w:t xml:space="preserve">  |  Principal Financial Group</w:t>
       </w:r>
       <w:r>
         <w:rPr>
           <w:color w:val="555555"/>
         </w:rPr>
         <w:tab/>
-        <w:t xml:space="preserve">November 2021 – Present</w:t>
+        <w:t xml:space="preserve">June 2024 – December 2024</w:t>
       </w:r>
     </w:p>
     <w:p>
@@ -1341,7 +1459,7 @@
           <w:sz w:val="18"/>
           <w:szCs w:val="18"/>
         </w:rPr>
-        <w:t xml:space="preserve">Remote</w:t>
+        <w:t xml:space="preserve">Des Moines, IA (Remote)</w:t>
       </w:r>
     </w:p>
     <w:p>
@@ -1349,7 +1467,7 @@
         <w:spacing w:after="40" w:before="0"/>
       </w:pPr>
       <w:r>
-        <w:t xml:space="preserve">The company's sole developer and IT person for its clinic payment and patient management platform, inherited from a larger development team. Report directly to leadership and own technology strategy and roadmap, budget and vendor selection, and security and compliance. Partner closely with teams at the company's software vendors, including DataX, ACHeck, and Web.com.</w:t>
+        <w:t xml:space="preserve">Modernized legacy .NET applications and the pipelines that ship them.</w:t>
       </w:r>
     </w:p>
     <w:p>
@@ -1362,7 +1480,7 @@
         <w:spacing w:after="20"/>
       </w:pPr>
       <w:r>
-        <w:t xml:space="preserve">Cut monthly AWS costs ~91%, from ~$1,400 to ~$120, over three years of incremental modernization with Terraform, CloudFront path-based routing, and right-sized infrastructure, while improving availability, stability, and speed.</w:t>
+        <w:t xml:space="preserve">Cut build times in existing pipelines by 80%+, tightening developer feedback loops.</w:t>
       </w:r>
     </w:p>
     <w:p>
@@ -1375,7 +1493,62 @@
         <w:spacing w:after="20"/>
       </w:pPr>
       <w:r>
-        <w:t xml:space="preserve">Modernized the platform from an AngularJS frontend, .NET Framework API, and SQL Server with SQL Jobs on Windows Server 2012 EC2 instances to SSR Next.js on AWS via OpenNext, modern .NET Minimal APIs on AWS Lambda, PostgreSQL on AWS RDS, and crontab on a nano Linux instance.</w:t>
+        <w:t xml:space="preserve">Set up CI/CD in GitHub Actions and supported on-prem-to-AWS migrations using Lambda and SNS.</w:t>
+      </w:r>
+    </w:p>
+    <w:p>
+      <w:pPr>
+        <w:keepNext/>
+        <w:tabs>
+          <w:tab w:val="right" w:pos="10512"/>
+        </w:tabs>
+        <w:spacing w:after="0" w:before="110"/>
+      </w:pPr>
+      <w:r>
+        <w:rPr>
+          <w:b/>
+          <w:bCs/>
+        </w:rPr>
+        <w:t xml:space="preserve">Software Engineer 3</w:t>
+      </w:r>
+      <w:r>
+        <w:rPr>
+          <w:b/>
+          <w:bCs/>
+          <w:color w:val="1F3A5F"/>
+        </w:rPr>
+        <w:t xml:space="preserve">  |  Wellabe, Inc.</w:t>
+      </w:r>
+      <w:r>
+        <w:rPr>
+          <w:color w:val="555555"/>
+        </w:rPr>
+        <w:tab/>
+        <w:t xml:space="preserve">July 2022 – June 2024</w:t>
+      </w:r>
+    </w:p>
+    <w:p>
+      <w:pPr>
+        <w:keepNext/>
+        <w:spacing w:after="40"/>
+      </w:pPr>
+      <w:r>
+        <w:rPr>
+          <w:i/>
+          <w:iCs/>
+          <w:color w:val="555555"/>
+          <w:sz w:val="18"/>
+          <w:szCs w:val="18"/>
+        </w:rPr>
+        <w:t xml:space="preserve">Des Moines, IA</w:t>
+      </w:r>
+    </w:p>
+    <w:p>
+      <w:pPr>
+        <w:spacing w:after="40" w:before="0"/>
+      </w:pPr>
+      <w:r>
+        <w:t xml:space="preserve">Led small teams modernizing the company's software and unifying its tech stack.</w:t>
       </w:r>
     </w:p>
     <w:p>
@@ -1388,7 +1561,7 @@
         <w:spacing w:after="20"/>
       </w:pPr>
       <w:r>
-        <w:t xml:space="preserve">Integrated third-party software offerings with resiliency and fallback plans for critical processes, including ACH payment processing.</w:t>
+        <w:t xml:space="preserve">Led the team that owned the company's main revenue-generating product, training and supporting every engineer on it.</w:t>
       </w:r>
     </w:p>
     <w:p>
@@ -1401,44 +1574,46 @@
         <w:spacing w:after="20"/>
       </w:pPr>
       <w:r>
-        <w:t xml:space="preserve">Handle everything from patient onboarding and document signing to customer support and keeping the lights on.</w:t>
-      </w:r>
-    </w:p>
-    <w:p>
-      <w:pPr>
-        <w:spacing w:after="0" w:before="40"/>
-      </w:pPr>
-      <w:r>
-        <w:rPr>
-          <w:b/>
-          <w:bCs/>
-          <w:sz w:val="18"/>
-          <w:szCs w:val="18"/>
-        </w:rPr>
-        <w:t xml:space="preserve">Technologies: </w:t>
-      </w:r>
-      <w:r>
-        <w:rPr>
-          <w:color w:val="555555"/>
-          <w:sz w:val="18"/>
-          <w:szCs w:val="18"/>
-        </w:rPr>
-        <w:t xml:space="preserve">.NET Framework 4.5 → .NET 10, AngularJS → Next.js, SQL Server → PostgreSQL, EC2 → CloudFront + Lambda + OpenNext, SQL Jobs → Linux (crontab), Terraform</w:t>
-      </w:r>
-    </w:p>
-    <w:p>
-      <w:pPr>
-        <w:spacing w:after="0" w:before="20"/>
-      </w:pPr>
-      <w:r>
-        <w:rPr>
-          <w:i/>
-          <w:iCs/>
-          <w:color w:val="555555"/>
-          <w:sz w:val="18"/>
-          <w:szCs w:val="18"/>
-        </w:rPr>
-        <w:t xml:space="preserve">Currently part-time, supporting new feature requests and regular software updates.</w:t>
+        <w:t xml:space="preserve">Mentored 7 junior and mid-level engineers and paired with each intern for their entire internship.</w:t>
+      </w:r>
+    </w:p>
+    <w:p>
+      <w:pPr>
+        <w:pStyle w:val="ListParagraph"/>
+        <w:numPr>
+          <w:ilvl w:val="0"/>
+          <w:numId w:val="2"/>
+        </w:numPr>
+        <w:spacing w:after="20"/>
+      </w:pPr>
+      <w:r>
+        <w:t xml:space="preserve">Migrated WPF desktop apps to Blazor web apps and improved the performance of legacy software.</w:t>
+      </w:r>
+    </w:p>
+    <w:p>
+      <w:pPr>
+        <w:pStyle w:val="ListParagraph"/>
+        <w:numPr>
+          <w:ilvl w:val="0"/>
+          <w:numId w:val="2"/>
+        </w:numPr>
+        <w:spacing w:after="20"/>
+      </w:pPr>
+      <w:r>
+        <w:t xml:space="preserve">Reengineered CI/CD to increase developer throughput and added test-coverage requirements.</w:t>
+      </w:r>
+    </w:p>
+    <w:p>
+      <w:pPr>
+        <w:pStyle w:val="ListParagraph"/>
+        <w:numPr>
+          <w:ilvl w:val="0"/>
+          <w:numId w:val="2"/>
+        </w:numPr>
+        <w:spacing w:after="20"/>
+      </w:pPr>
+      <w:r>
+        <w:t xml:space="preserve">Improved business-critical daily batch programs and built a department wiki to centralize documentation.</w:t>
       </w:r>
     </w:p>
     <w:p>
@@ -1454,7 +1629,7 @@
           <w:b/>
           <w:bCs/>
         </w:rPr>
-        <w:t xml:space="preserve">Contract Senior Software Engineer</w:t>
+        <w:t xml:space="preserve">Contract Senior Software Developer</w:t>
       </w:r>
       <w:r>
         <w:rPr>
@@ -1462,14 +1637,14 @@
           <w:bCs/>
           <w:color w:val="1F3A5F"/>
         </w:rPr>
-        <w:t xml:space="preserve">  |  Principal Financial Group</w:t>
+        <w:t xml:space="preserve">  |  Far Reach Inc.</w:t>
       </w:r>
       <w:r>
         <w:rPr>
           <w:color w:val="555555"/>
         </w:rPr>
         <w:tab/>
-        <w:t xml:space="preserve">June 2024 – December 2024</w:t>
+        <w:t xml:space="preserve">March 2022 – June 2022</w:t>
       </w:r>
     </w:p>
     <w:p>
@@ -1485,7 +1660,7 @@
           <w:sz w:val="18"/>
           <w:szCs w:val="18"/>
         </w:rPr>
-        <w:t xml:space="preserve">Des Moines, IA (Remote)</w:t>
+        <w:t xml:space="preserve">Contract via Modis</w:t>
       </w:r>
     </w:p>
     <w:p>
@@ -1493,7 +1668,7 @@
         <w:spacing w:after="40" w:before="0"/>
       </w:pPr>
       <w:r>
-        <w:t xml:space="preserve">Upgraded legacy .NET applications and set up CI/CD pipelines using GitHub Actions. Supported the team on migrations from on-prem to AWS, including Lambda for serverless applications and SNS for pub/sub messaging. Reduced build times in existing pipelines by at least 80% to improve developer experience and tighten feedback loops.</w:t>
+        <w:t xml:space="preserve">Built full-stack features for a homegrown ERP system with Angular, RxJS, .NET, and SQL Server on Azure, using ASP.NET Boilerplate, PrimeNG, and Bootstrap.</w:t>
       </w:r>
     </w:p>
     <w:p>
@@ -1509,7 +1684,7 @@
           <w:b/>
           <w:bCs/>
         </w:rPr>
-        <w:t xml:space="preserve">Software Engineer 3</w:t>
+        <w:t xml:space="preserve">Software Engineer</w:t>
       </w:r>
       <w:r>
         <w:rPr>
@@ -1517,38 +1692,22 @@
           <w:bCs/>
           <w:color w:val="1F3A5F"/>
         </w:rPr>
-        <w:t xml:space="preserve">  |  Wellabe, Inc.</w:t>
+        <w:t xml:space="preserve">  |  Hy-Vee, Inc.</w:t>
       </w:r>
       <w:r>
         <w:rPr>
           <w:color w:val="555555"/>
         </w:rPr>
         <w:tab/>
-        <w:t xml:space="preserve">July 2022 – June 2024</w:t>
-      </w:r>
-    </w:p>
-    <w:p>
-      <w:pPr>
-        <w:keepNext/>
-        <w:spacing w:after="40"/>
-      </w:pPr>
-      <w:r>
-        <w:rPr>
-          <w:i/>
-          <w:iCs/>
-          <w:color w:val="555555"/>
-          <w:sz w:val="18"/>
-          <w:szCs w:val="18"/>
-        </w:rPr>
-        <w:t xml:space="preserve">Des Moines, IA</w:t>
-      </w:r>
-    </w:p>
-    <w:p>
-      <w:pPr>
-        <w:spacing w:after="40" w:before="0"/>
-      </w:pPr>
-      <w:r>
-        <w:t xml:space="preserve">Led several small teams rewriting parts or all of applications to unify the company tech stack, adopt modern frameworks and tooling, and optimize the performance of legacy software. Migrated older WPF desktop apps to Blazor web apps. Supported and improved daily business-critical batch programs. Reengineered CI/CD processes to increase developer throughput and added requirements to encourage test coverage. Built a department wiki to centralize company, department, and team documentation. Served as senior engineering mentor to 7 junior and mid-level engineers.</w:t>
+        <w:t xml:space="preserve">October 2019 – March 2022</w:t>
+      </w:r>
+    </w:p>
+    <w:p>
+      <w:pPr>
+        <w:spacing w:after="40" w:before="40"/>
+      </w:pPr>
+      <w:r>
+        <w:t xml:space="preserve">Worked across legacy .NET and WinForms applications and greenfield React, Kotlin, Spring Boot, Ktor, and GraphQL services, federated with Apollo on Google Cloud.</w:t>
       </w:r>
     </w:p>
     <w:p>
@@ -1561,7 +1720,7 @@
         <w:spacing w:after="20"/>
       </w:pPr>
       <w:r>
-        <w:t xml:space="preserve">Led the team that owned the company's main revenue-generating software product, delivering features on request.</w:t>
+        <w:t xml:space="preserve">Helped build a Tax API on a task force, managing product tax values for 450+ grocery and convenience stores and publishing updates to every store over pub/sub.</w:t>
       </w:r>
     </w:p>
     <w:p>
@@ -1574,7 +1733,33 @@
         <w:spacing w:after="20"/>
       </w:pPr>
       <w:r>
-        <w:t xml:space="preserve">Responsible for every engineer on the team: trained them, answered their questions, and paired with each intern for their entire internship.</w:t>
+        <w:t xml:space="preserve">Seeded new stores with millions of tax records in batches, with a check after each batch that every item was accounted for.</w:t>
+      </w:r>
+    </w:p>
+    <w:p>
+      <w:pPr>
+        <w:pStyle w:val="ListParagraph"/>
+        <w:numPr>
+          <w:ilvl w:val="0"/>
+          <w:numId w:val="2"/>
+        </w:numPr>
+        <w:spacing w:after="20"/>
+      </w:pPr>
+      <w:r>
+        <w:t xml:space="preserve">Led the move of widely used shared libraries from a file share to GitHub, with CI/CD, artifact storage, and automated tests.</w:t>
+      </w:r>
+    </w:p>
+    <w:p>
+      <w:pPr>
+        <w:pStyle w:val="ListParagraph"/>
+        <w:numPr>
+          <w:ilvl w:val="0"/>
+          <w:numId w:val="2"/>
+        </w:numPr>
+        <w:spacing w:after="20"/>
+      </w:pPr>
+      <w:r>
+        <w:t xml:space="preserve">Cut CI/CD build times by 50%+.</w:t>
       </w:r>
     </w:p>
     <w:p>
@@ -1590,7 +1775,7 @@
           <w:b/>
           <w:bCs/>
         </w:rPr>
-        <w:t xml:space="preserve">Contract Senior Software Developer</w:t>
+        <w:t xml:space="preserve">Software Developer</w:t>
       </w:r>
       <w:r>
         <w:rPr>
@@ -1598,14 +1783,14 @@
           <w:bCs/>
           <w:color w:val="1F3A5F"/>
         </w:rPr>
-        <w:t xml:space="preserve">  |  Far Reach Inc.</w:t>
+        <w:t xml:space="preserve">  |  Stine Seed, Inc.</w:t>
       </w:r>
       <w:r>
         <w:rPr>
           <w:color w:val="555555"/>
         </w:rPr>
         <w:tab/>
-        <w:t xml:space="preserve">March 2022 – June 2022</w:t>
+        <w:t xml:space="preserve">May 2019 – October 2019</w:t>
       </w:r>
     </w:p>
     <w:p>
@@ -1621,7 +1806,7 @@
           <w:sz w:val="18"/>
           <w:szCs w:val="18"/>
         </w:rPr>
-        <w:t xml:space="preserve">Contract via Modis</w:t>
+        <w:t xml:space="preserve">Dallas Center, IA</w:t>
       </w:r>
     </w:p>
     <w:p>
@@ -1629,7 +1814,7 @@
         <w:spacing w:after="40" w:before="0"/>
       </w:pPr>
       <w:r>
-        <w:t xml:space="preserve">Consulted on a homegrown ERP system. Implemented full-stack features and changes using Angular, RxJS, .NET, and SQL Server on a hosted Azure instance. Accelerated development using ASP.NET Boilerplate, PrimeNG, and Bootstrap.</w:t>
+        <w:t xml:space="preserve">Built features for employee portals that manage seed production, packaging, and sales (Angular, .NET Core), set up CI/CD in Azure DevOps, and kept a tight feedback loop with users.</w:t>
       </w:r>
     </w:p>
     <w:p>
@@ -1645,7 +1830,7 @@
           <w:b/>
           <w:bCs/>
         </w:rPr>
-        <w:t xml:space="preserve">Software Engineer</w:t>
+        <w:t xml:space="preserve">Associate .NET Developer</w:t>
       </w:r>
       <w:r>
         <w:rPr>
@@ -1653,22 +1838,120 @@
           <w:bCs/>
           <w:color w:val="1F3A5F"/>
         </w:rPr>
-        <w:t xml:space="preserve">  |  Hy-Vee, Inc.</w:t>
+        <w:t xml:space="preserve">  |  Brownells, Inc.</w:t>
       </w:r>
       <w:r>
         <w:rPr>
           <w:color w:val="555555"/>
         </w:rPr>
         <w:tab/>
-        <w:t xml:space="preserve">October 2019 – March 2022</w:t>
-      </w:r>
-    </w:p>
-    <w:p>
-      <w:pPr>
-        <w:spacing w:after="40" w:before="40"/>
-      </w:pPr>
-      <w:r>
-        <w:t xml:space="preserve">Led an effort to migrate widely used code libraries from a file share to a GitHub repository with a full CI/CD pipeline, cloud artifact storage, and automated test suites. Leveraged existing CI/CD technologies to cut pipeline build times by at least 50%. Legacy applications were primarily .NET (mixed C# and VB) with WinForms frontends. Greenfield applications were built with React and RxJS on a backend of Kotlin, Spring Boot, Ktor, and GraphQL, federated into a supergraph with Apollo Federation and hosted on Google Cloud.</w:t>
+        <w:t xml:space="preserve">January 2018 – April 2019</w:t>
+      </w:r>
+    </w:p>
+    <w:p>
+      <w:pPr>
+        <w:keepNext/>
+        <w:spacing w:after="40"/>
+      </w:pPr>
+      <w:r>
+        <w:rPr>
+          <w:i/>
+          <w:iCs/>
+          <w:color w:val="555555"/>
+          <w:sz w:val="18"/>
+          <w:szCs w:val="18"/>
+        </w:rPr>
+        <w:t xml:space="preserve">Grinnell, IA</w:t>
+      </w:r>
+    </w:p>
+    <w:p>
+      <w:pPr>
+        <w:spacing w:after="40" w:before="0"/>
+      </w:pPr>
+      <w:r>
+        <w:t xml:space="preserve">Integrated a new third-party ERP with existing WMS and POS systems, building pub/sub message pathways and failover on IBM MQ, with a Razor Pages, jQuery, and Bootstrap frontend on .NET Framework APIs.</w:t>
+      </w:r>
+    </w:p>
+    <w:p>
+      <w:pPr>
+        <w:keepNext/>
+        <w:tabs>
+          <w:tab w:val="right" w:pos="10512"/>
+        </w:tabs>
+        <w:spacing w:after="0" w:before="110"/>
+      </w:pPr>
+      <w:r>
+        <w:rPr>
+          <w:b/>
+          <w:bCs/>
+        </w:rPr>
+        <w:t xml:space="preserve">Package Handler → Local Sort Supervisor → Package Center Supervisor</w:t>
+      </w:r>
+      <w:r>
+        <w:rPr>
+          <w:b/>
+          <w:bCs/>
+          <w:color w:val="1F3A5F"/>
+        </w:rPr>
+        <w:t xml:space="preserve">  |  UPS</w:t>
+      </w:r>
+      <w:r>
+        <w:rPr>
+          <w:color w:val="555555"/>
+        </w:rPr>
+        <w:tab/>
+        <w:t xml:space="preserve">March 2013 – December 2017</w:t>
+      </w:r>
+    </w:p>
+    <w:p>
+      <w:pPr>
+        <w:keepNext/>
+        <w:spacing w:after="40"/>
+      </w:pPr>
+      <w:r>
+        <w:rPr>
+          <w:i/>
+          <w:iCs/>
+          <w:color w:val="555555"/>
+          <w:sz w:val="18"/>
+          <w:szCs w:val="18"/>
+        </w:rPr>
+        <w:t xml:space="preserve">Ames, IA</w:t>
+      </w:r>
+    </w:p>
+    <w:p>
+      <w:pPr>
+        <w:spacing w:after="40" w:before="0"/>
+      </w:pPr>
+      <w:r>
+        <w:t xml:space="preserve">Promoted twice in two years. Supervised 30+ drivers and 40+ inside employees on safety, production, and attendance, and personally trained more than half of them.</w:t>
+      </w:r>
+    </w:p>
+    <w:p>
+      <w:pPr>
+        <w:keepNext/>
+        <w:tabs>
+          <w:tab w:val="right" w:pos="10512"/>
+        </w:tabs>
+        <w:spacing w:after="20" w:before="60"/>
+      </w:pPr>
+      <w:r>
+        <w:rPr>
+          <w:b/>
+          <w:bCs/>
+          <w:i/>
+          <w:iCs/>
+        </w:rPr>
+        <w:t xml:space="preserve">Package Center Supervisor</w:t>
+      </w:r>
+      <w:r>
+        <w:rPr>
+          <w:i/>
+          <w:iCs/>
+          <w:color w:val="555555"/>
+        </w:rPr>
+        <w:tab/>
+        <w:t xml:space="preserve">March 2015 – December 2017</w:t>
       </w:r>
     </w:p>
     <w:p>
@@ -1681,7 +1964,34 @@
         <w:spacing w:after="20"/>
       </w:pPr>
       <w:r>
-        <w:t xml:space="preserve">Served on a task force that built a Tax API to manage tax values for retail products at every Hy-Vee location (roughly 280 grocery stores and 175 convenience stores at the time).</w:t>
+        <w:t xml:space="preserve">Ran daytime delivery operations for every driver: kept routes on track, handled emergencies, and tracked fuel use, time-card accuracy, and the delivery-area map.</w:t>
+      </w:r>
+    </w:p>
+    <w:p>
+      <w:pPr>
+        <w:keepNext/>
+        <w:tabs>
+          <w:tab w:val="right" w:pos="10512"/>
+        </w:tabs>
+        <w:spacing w:after="20" w:before="60"/>
+      </w:pPr>
+      <w:r>
+        <w:rPr>
+          <w:b/>
+          <w:bCs/>
+          <w:i/>
+          <w:iCs/>
+        </w:rPr>
+        <w:t xml:space="preserve">Local Sort Supervisor</w:t>
+      </w:r>
+      <w:r>
+        <w:rPr>
+          <w:i/>
+          <w:iCs/>
+          <w:color w:val="555555"/>
+        </w:rPr>
+        <w:tab/>
+        <w:t xml:space="preserve">March 2014 – March 2015</w:t>
       </w:r>
     </w:p>
     <w:p>
@@ -1694,7 +2004,34 @@
         <w:spacing w:after="20"/>
       </w:pPr>
       <w:r>
-        <w:t xml:space="preserve">Solved the problem of loading millions of tax records onto the servers of newly built stores: data went out in batches, with a check after each batch to confirm every item was accounted for.</w:t>
+        <w:t xml:space="preserve">Ran the evening sort of 30+ package cars into five outbound trailers, and handled training, certifications, terminations, and personnel management.</w:t>
+      </w:r>
+    </w:p>
+    <w:p>
+      <w:pPr>
+        <w:keepNext/>
+        <w:tabs>
+          <w:tab w:val="right" w:pos="10512"/>
+        </w:tabs>
+        <w:spacing w:after="20" w:before="60"/>
+      </w:pPr>
+      <w:r>
+        <w:rPr>
+          <w:b/>
+          <w:bCs/>
+          <w:i/>
+          <w:iCs/>
+        </w:rPr>
+        <w:t xml:space="preserve">Package Handler</w:t>
+      </w:r>
+      <w:r>
+        <w:rPr>
+          <w:i/>
+          <w:iCs/>
+          <w:color w:val="555555"/>
+        </w:rPr>
+        <w:tab/>
+        <w:t xml:space="preserve">March 2013 – March 2014</w:t>
       </w:r>
     </w:p>
     <w:p>
@@ -1707,344 +2044,7 @@
         <w:spacing w:after="20"/>
       </w:pPr>
       <w:r>
-        <w:t xml:space="preserve">Used a pub/sub architecture to release new tax values to all stores.</w:t>
-      </w:r>
-    </w:p>
-    <w:p>
-      <w:pPr>
-        <w:keepNext/>
-        <w:tabs>
-          <w:tab w:val="right" w:pos="10512"/>
-        </w:tabs>
-        <w:spacing w:after="0" w:before="110"/>
-      </w:pPr>
-      <w:r>
-        <w:rPr>
-          <w:b/>
-          <w:bCs/>
-        </w:rPr>
-        <w:t xml:space="preserve">Software Developer</w:t>
-      </w:r>
-      <w:r>
-        <w:rPr>
-          <w:b/>
-          <w:bCs/>
-          <w:color w:val="1F3A5F"/>
-        </w:rPr>
-        <w:t xml:space="preserve">  |  Stine Seed, Inc.</w:t>
-      </w:r>
-      <w:r>
-        <w:rPr>
-          <w:color w:val="555555"/>
-        </w:rPr>
-        <w:tab/>
-        <w:t xml:space="preserve">May 2019 – October 2019</w:t>
-      </w:r>
-    </w:p>
-    <w:p>
-      <w:pPr>
-        <w:keepNext/>
-        <w:spacing w:after="40"/>
-      </w:pPr>
-      <w:r>
-        <w:rPr>
-          <w:i/>
-          <w:iCs/>
-          <w:color w:val="555555"/>
-          <w:sz w:val="18"/>
-          <w:szCs w:val="18"/>
-        </w:rPr>
-        <w:t xml:space="preserve">Dallas Center, IA</w:t>
-      </w:r>
-    </w:p>
-    <w:p>
-      <w:pPr>
-        <w:spacing w:after="40" w:before="0"/>
-      </w:pPr>
-      <w:r>
-        <w:t xml:space="preserve">Developed features for employee-facing portals used to manage seed production, packaging, and sales. Maintained a tight feedback loop with users as implementations were deployed and tested. Used Angular for the frontend and .NET Core for the backend, with CI/CD handled through custom Azure DevOps processes I built.</w:t>
-      </w:r>
-    </w:p>
-    <w:p>
-      <w:pPr>
-        <w:keepNext/>
-        <w:tabs>
-          <w:tab w:val="right" w:pos="10512"/>
-        </w:tabs>
-        <w:spacing w:after="0" w:before="110"/>
-      </w:pPr>
-      <w:r>
-        <w:rPr>
-          <w:b/>
-          <w:bCs/>
-        </w:rPr>
-        <w:t xml:space="preserve">Associate .NET Developer</w:t>
-      </w:r>
-      <w:r>
-        <w:rPr>
-          <w:b/>
-          <w:bCs/>
-          <w:color w:val="1F3A5F"/>
-        </w:rPr>
-        <w:t xml:space="preserve">  |  Brownells, Inc.</w:t>
-      </w:r>
-      <w:r>
-        <w:rPr>
-          <w:color w:val="555555"/>
-        </w:rPr>
-        <w:tab/>
-        <w:t xml:space="preserve">January 2018 – April 2019</w:t>
-      </w:r>
-    </w:p>
-    <w:p>
-      <w:pPr>
-        <w:keepNext/>
-        <w:spacing w:after="40"/>
-      </w:pPr>
-      <w:r>
-        <w:rPr>
-          <w:i/>
-          <w:iCs/>
-          <w:color w:val="555555"/>
-          <w:sz w:val="18"/>
-          <w:szCs w:val="18"/>
-        </w:rPr>
-        <w:t xml:space="preserve">Grinnell, IA</w:t>
-      </w:r>
-    </w:p>
-    <w:p>
-      <w:pPr>
-        <w:spacing w:after="40" w:before="0"/>
-      </w:pPr>
-      <w:r>
-        <w:t xml:space="preserve">Integrated a new third-party ERP offering with existing WMS and POS systems. Constructed message pathways and failover processes in a pub/sub architecture between all systems. The frontend was built with Razor Pages, jQuery, AJAX, and Bootstrap; the backend used .NET Framework ASP.NET APIs, with a message bus built on IBM MQ.</w:t>
-      </w:r>
-    </w:p>
-    <w:p>
-      <w:pPr>
-        <w:keepNext/>
-        <w:tabs>
-          <w:tab w:val="right" w:pos="10512"/>
-        </w:tabs>
-        <w:spacing w:after="0" w:before="110"/>
-      </w:pPr>
-      <w:r>
-        <w:rPr>
-          <w:b/>
-          <w:bCs/>
-        </w:rPr>
-        <w:t xml:space="preserve">Package Handler → Local Sort Supervisor → Package Center Supervisor</w:t>
-      </w:r>
-      <w:r>
-        <w:rPr>
-          <w:b/>
-          <w:bCs/>
-          <w:color w:val="1F3A5F"/>
-        </w:rPr>
-        <w:t xml:space="preserve">  |  UPS</w:t>
-      </w:r>
-      <w:r>
-        <w:rPr>
-          <w:color w:val="555555"/>
-        </w:rPr>
-        <w:tab/>
-        <w:t xml:space="preserve">March 2013 – December 2017</w:t>
-      </w:r>
-    </w:p>
-    <w:p>
-      <w:pPr>
-        <w:keepNext/>
-        <w:spacing w:after="40"/>
-      </w:pPr>
-      <w:r>
-        <w:rPr>
-          <w:i/>
-          <w:iCs/>
-          <w:color w:val="555555"/>
-          <w:sz w:val="18"/>
-          <w:szCs w:val="18"/>
-        </w:rPr>
-        <w:t xml:space="preserve">Ames, IA</w:t>
-      </w:r>
-    </w:p>
-    <w:p>
-      <w:pPr>
-        <w:spacing w:after="40" w:before="0"/>
-      </w:pPr>
-      <w:r>
-        <w:t xml:space="preserve">Promoted twice, from package handler to Package Center Supervisor. Supervised 30+ drivers and 40+ inside employees, holding workgroups accountable for safety, production, and attendance. Personally trained more than half of them and kept their certifications current.</w:t>
-      </w:r>
-    </w:p>
-    <w:p>
-      <w:pPr>
-        <w:keepNext/>
-        <w:tabs>
-          <w:tab w:val="right" w:pos="10512"/>
-        </w:tabs>
-        <w:spacing w:after="20" w:before="60"/>
-      </w:pPr>
-      <w:r>
-        <w:rPr>
-          <w:b/>
-          <w:bCs/>
-          <w:i/>
-          <w:iCs/>
-        </w:rPr>
-        <w:t xml:space="preserve">Package Center Supervisor</w:t>
-      </w:r>
-      <w:r>
-        <w:rPr>
-          <w:i/>
-          <w:iCs/>
-          <w:color w:val="555555"/>
-        </w:rPr>
-        <w:tab/>
-        <w:t xml:space="preserve">March 2015 – December 2017</w:t>
-      </w:r>
-    </w:p>
-    <w:p>
-      <w:pPr>
-        <w:pStyle w:val="ListParagraph"/>
-        <w:numPr>
-          <w:ilvl w:val="0"/>
-          <w:numId w:val="2"/>
-        </w:numPr>
-        <w:spacing w:after="20"/>
-      </w:pPr>
-      <w:r>
-        <w:t xml:space="preserve">Oversaw all delivery drivers during the day, supporting their needs, keeping every route running smoothly, and handling emergencies.</w:t>
-      </w:r>
-    </w:p>
-    <w:p>
-      <w:pPr>
-        <w:pStyle w:val="ListParagraph"/>
-        <w:numPr>
-          <w:ilvl w:val="0"/>
-          <w:numId w:val="2"/>
-        </w:numPr>
-        <w:spacing w:after="20"/>
-      </w:pPr>
-      <w:r>
-        <w:t xml:space="preserve">Tracked operational data including fuel usage, time card accuracy, and a continually updated map of the delivery region.</w:t>
-      </w:r>
-    </w:p>
-    <w:p>
-      <w:pPr>
-        <w:keepNext/>
-        <w:tabs>
-          <w:tab w:val="right" w:pos="10512"/>
-        </w:tabs>
-        <w:spacing w:after="20" w:before="60"/>
-      </w:pPr>
-      <w:r>
-        <w:rPr>
-          <w:b/>
-          <w:bCs/>
-          <w:i/>
-          <w:iCs/>
-        </w:rPr>
-        <w:t xml:space="preserve">Local Sort Supervisor</w:t>
-      </w:r>
-      <w:r>
-        <w:rPr>
-          <w:i/>
-          <w:iCs/>
-          <w:color w:val="555555"/>
-        </w:rPr>
-        <w:tab/>
-        <w:t xml:space="preserve">March 2014 – March 2015</w:t>
-      </w:r>
-    </w:p>
-    <w:p>
-      <w:pPr>
-        <w:pStyle w:val="ListParagraph"/>
-        <w:numPr>
-          <w:ilvl w:val="0"/>
-          <w:numId w:val="2"/>
-        </w:numPr>
-        <w:spacing w:after="20"/>
-      </w:pPr>
-      <w:r>
-        <w:t xml:space="preserve">Ran the evening local sort, ensuring packages from 30+ package cars were unloaded and sorted into five outbound trailers, with small packages separated and bagged.</w:t>
-      </w:r>
-    </w:p>
-    <w:p>
-      <w:pPr>
-        <w:pStyle w:val="ListParagraph"/>
-        <w:numPr>
-          <w:ilvl w:val="0"/>
-          <w:numId w:val="2"/>
-        </w:numPr>
-        <w:spacing w:after="20"/>
-      </w:pPr>
-      <w:r>
-        <w:t xml:space="preserve">Handled training, terminations, and other personnel management for the sort crew.</w:t>
-      </w:r>
-    </w:p>
-    <w:p>
-      <w:pPr>
-        <w:keepNext/>
-        <w:tabs>
-          <w:tab w:val="right" w:pos="10512"/>
-        </w:tabs>
-        <w:spacing w:after="20" w:before="60"/>
-      </w:pPr>
-      <w:r>
-        <w:rPr>
-          <w:b/>
-          <w:bCs/>
-          <w:i/>
-          <w:iCs/>
-        </w:rPr>
-        <w:t xml:space="preserve">Package Handler</w:t>
-      </w:r>
-      <w:r>
-        <w:rPr>
-          <w:i/>
-          <w:iCs/>
-          <w:color w:val="555555"/>
-        </w:rPr>
-        <w:tab/>
-        <w:t xml:space="preserve">March 2013 – March 2014</w:t>
-      </w:r>
-    </w:p>
-    <w:p>
-      <w:pPr>
-        <w:pStyle w:val="ListParagraph"/>
-        <w:numPr>
-          <w:ilvl w:val="0"/>
-          <w:numId w:val="2"/>
-        </w:numPr>
-        <w:spacing w:after="20"/>
-      </w:pPr>
-      <w:r>
-        <w:t xml:space="preserve">Loaded and unloaded trucks.</w:t>
-      </w:r>
-    </w:p>
-    <w:p>
-      <w:pPr>
-        <w:pStyle w:val="ListParagraph"/>
-        <w:numPr>
-          <w:ilvl w:val="0"/>
-          <w:numId w:val="2"/>
-        </w:numPr>
-        <w:spacing w:after="20"/>
-      </w:pPr>
-      <w:r>
-        <w:t xml:space="preserve">Moved into international package processing, verifying packages met requirements to ship internationally by air or freight.</w:t>
-      </w:r>
-    </w:p>
-    <w:p>
-      <w:pPr>
-        <w:pStyle w:val="ListParagraph"/>
-        <w:numPr>
-          <w:ilvl w:val="0"/>
-          <w:numId w:val="2"/>
-        </w:numPr>
-        <w:spacing w:after="20"/>
-      </w:pPr>
-      <w:r>
-        <w:t xml:space="preserve">Trained in hazardous materials handling, classification, and proper shipping.</w:t>
+        <w:t xml:space="preserve">Loaded and unloaded trucks, then processed international shipments for air and freight; trained in hazardous-materials handling and classification.</w:t>
       </w:r>
     </w:p>
     <w:p>

</xml_diff>

<commit_message>
Fix Patient Preferred YAML port and regenerate downloads
- Remove the literal \n\n and duplicated Technologies line from the summary;
  move the new stack into the job's technologies list
- Port the Cloud skill changes (Lambda, OpenNext; drop Amplify, Elastic
  Beanstalk, EventBridge) from the hand-edited JSON into resume.yaml
- Flatten the default-only highlight text
- Wording: "on AWS via OpenNext", and fix the double "and" in the list

Co-Authored-By: Claude Opus 5.5 <noreply@anthropic.com>
</commit_message>
<xml_diff>
--- a/apps/web/public/downloads/base/Ryan Jensen - Resume.docx
+++ b/apps/web/public/downloads/base/Ryan Jensen - Resume.docx
@@ -53,7 +53,7 @@
         </w:rPr>
         <w:t xml:space="preserve"> · </w:t>
       </w:r>
-      <w:hyperlink w:history="1" r:id="rIdgoja5lhaavsiucfhvtgvq">
+      <w:hyperlink w:history="1" r:id="rIdggeypzvm9mqdqacn10fbl">
         <w:r>
           <w:rPr>
             <w:color w:val="1F3A5F"/>
@@ -67,7 +67,7 @@
         </w:rPr>
         <w:t xml:space="preserve"> · </w:t>
       </w:r>
-      <w:hyperlink w:history="1" r:id="rIdt9nz7ctrwrexmqbumxphq">
+      <w:hyperlink w:history="1" r:id="rId4d3krsilwjztn2dkxmpwj">
         <w:r>
           <w:rPr>
             <w:color w:val="1F3A5F"/>
@@ -81,7 +81,7 @@
         </w:rPr>
         <w:t xml:space="preserve"> · </w:t>
       </w:r>
-      <w:hyperlink w:history="1" r:id="rId5ag2a9pkwwiujgqp6bnd6">
+      <w:hyperlink w:history="1" r:id="rIdzervviy9iv_rein5zo5kz">
         <w:r>
           <w:rPr>
             <w:color w:val="1F3A5F"/>
@@ -924,16 +924,6 @@
           <w:b w:val="false"/>
           <w:bCs w:val="false"/>
         </w:rPr>
-        <w:t xml:space="preserve">AWS Lambda</w:t>
-      </w:r>
-      <w:r>
-        <w:t xml:space="preserve">, </w:t>
-      </w:r>
-      <w:r>
-        <w:rPr>
-          <w:b w:val="false"/>
-          <w:bCs w:val="false"/>
-        </w:rPr>
         <w:t xml:space="preserve">EC2</w:t>
       </w:r>
       <w:r>
@@ -974,27 +964,17 @@
           <w:b w:val="false"/>
           <w:bCs w:val="false"/>
         </w:rPr>
-        <w:t xml:space="preserve">Amplify</w:t>
-      </w:r>
-      <w:r>
-        <w:t xml:space="preserve">, </w:t>
-      </w:r>
-      <w:r>
-        <w:rPr>
-          <w:b w:val="false"/>
-          <w:bCs w:val="false"/>
-        </w:rPr>
-        <w:t xml:space="preserve">Elastic Beanstalk</w:t>
-      </w:r>
-      <w:r>
-        <w:t xml:space="preserve">, </w:t>
-      </w:r>
-      <w:r>
-        <w:rPr>
-          <w:b w:val="false"/>
-          <w:bCs w:val="false"/>
-        </w:rPr>
-        <w:t xml:space="preserve">EventBridge</w:t>
+        <w:t xml:space="preserve">Lambda</w:t>
+      </w:r>
+      <w:r>
+        <w:t xml:space="preserve">, </w:t>
+      </w:r>
+      <w:r>
+        <w:rPr>
+          <w:b w:val="false"/>
+          <w:bCs w:val="false"/>
+        </w:rPr>
+        <w:t xml:space="preserve">OpenNext</w:t>
       </w:r>
     </w:p>
     <w:p>
@@ -1395,7 +1375,7 @@
         <w:spacing w:after="20"/>
       </w:pPr>
       <w:r>
-        <w:t xml:space="preserve">Modernized the platform from an AngularJS frontend and .NET Framework 4.5 API on Windows Server 2012 EC2 instances to React on AWS Amplify and a .NET 10 Minimal API on Elastic Beanstalk, with SQL Server moved to RDS and SQL Agent jobs replaced by EventBridge-triggered Lambda functions and cron jobs on a small Linux instance. Now migrating the database to PostgreSQL and moving the platform toward serverless.</w:t>
+        <w:t xml:space="preserve">Modernized the platform from an AngularJS frontend, .NET Framework API, and SQL Server with SQL Jobs on Windows Server 2012 EC2 instances to SSR Next.js on AWS via OpenNext, modern .NET Minimal APIs on AWS Lambda, PostgreSQL on AWS RDS, and crontab on a nano Linux instance.</w:t>
       </w:r>
     </w:p>
     <w:p>
@@ -1443,7 +1423,7 @@
           <w:sz w:val="18"/>
           <w:szCs w:val="18"/>
         </w:rPr>
-        <w:t xml:space="preserve">.NET Framework 4.5 → .NET 10, AngularJS → React, SQL Server → PostgreSQL (in progress), AWS Amplify, Elastic Beanstalk, RDS, EventBridge + Lambda, Linux (cron), CloudFront, Terraform</w:t>
+        <w:t xml:space="preserve">.NET Framework 4.5 → .NET 10, AngularJS → Next.js, SQL Server → PostgreSQL, EC2 → CloudFront + Lambda + OpenNext, SQL Jobs → Linux (crontab), Terraform</w:t>
       </w:r>
     </w:p>
     <w:p>

</xml_diff>

<commit_message>
Regenerate downloads for interview label and start-date fixes
Co-Authored-By: Claude Opus 5.5 <noreply@anthropic.com>
</commit_message>
<xml_diff>
--- a/apps/web/public/downloads/base/Ryan Jensen - Resume.docx
+++ b/apps/web/public/downloads/base/Ryan Jensen - Resume.docx
@@ -53,7 +53,7 @@
         </w:rPr>
         <w:t xml:space="preserve"> · </w:t>
       </w:r>
-      <w:hyperlink w:history="1" r:id="rIdpqez37im-ot1uaz4mihbc">
+      <w:hyperlink w:history="1" r:id="rIdzi_u5wdtpvnfikqux4wkv">
         <w:r>
           <w:rPr>
             <w:color w:val="1F3A5F"/>
@@ -67,7 +67,7 @@
         </w:rPr>
         <w:t xml:space="preserve"> · </w:t>
       </w:r>
-      <w:hyperlink w:history="1" r:id="rIdtpk-y2zctwuz_crpvu6oj">
+      <w:hyperlink w:history="1" r:id="rIdpwsni-9svjhttjtgsju1l">
         <w:r>
           <w:rPr>
             <w:color w:val="1F3A5F"/>
@@ -81,7 +81,7 @@
         </w:rPr>
         <w:t xml:space="preserve"> · </w:t>
       </w:r>
-      <w:hyperlink w:history="1" r:id="rIdy-kt3-nwc91sgbjgb3cal">
+      <w:hyperlink w:history="1" r:id="rIdycsfelw5i1zolq3qkfxys">
         <w:r>
           <w:rPr>
             <w:color w:val="1F3A5F"/>
@@ -1790,7 +1790,7 @@
           <w:color w:val="555555"/>
         </w:rPr>
         <w:tab/>
-        <w:t xml:space="preserve">May 2019 – October 2019</w:t>
+        <w:t xml:space="preserve">April 2019 – October 2019</w:t>
       </w:r>
     </w:p>
     <w:p>
@@ -1845,7 +1845,7 @@
           <w:color w:val="555555"/>
         </w:rPr>
         <w:tab/>
-        <w:t xml:space="preserve">January 2018 – April 2019</w:t>
+        <w:t xml:space="preserve">December 2017 – April 2019</w:t>
       </w:r>
     </w:p>
     <w:p>

</xml_diff>

<commit_message>
Resume: client work at Source Allies and Far Reach; Identity skills and T-SQL
Co-Authored-By: Claude Opus 5.5 <noreply@anthropic.com>
</commit_message>
<xml_diff>
--- a/apps/web/public/downloads/base/Ryan Jensen - Resume.docx
+++ b/apps/web/public/downloads/base/Ryan Jensen - Resume.docx
@@ -53,7 +53,7 @@
         </w:rPr>
         <w:t xml:space="preserve"> · </w:t>
       </w:r>
-      <w:hyperlink w:history="1" r:id="rIdzi_u5wdtpvnfikqux4wkv">
+      <w:hyperlink w:history="1" r:id="rIdm9jsodnef3scdbfcrim3z">
         <w:r>
           <w:rPr>
             <w:color w:val="1F3A5F"/>
@@ -67,7 +67,7 @@
         </w:rPr>
         <w:t xml:space="preserve"> · </w:t>
       </w:r>
-      <w:hyperlink w:history="1" r:id="rIdpwsni-9svjhttjtgsju1l">
+      <w:hyperlink w:history="1" r:id="rId_avkmptpxaec4cf1txd-b">
         <w:r>
           <w:rPr>
             <w:color w:val="1F3A5F"/>
@@ -81,7 +81,7 @@
         </w:rPr>
         <w:t xml:space="preserve"> · </w:t>
       </w:r>
-      <w:hyperlink w:history="1" r:id="rIdycsfelw5i1zolq3qkfxys">
+      <w:hyperlink w:history="1" r:id="rIdb0iqbqsycuoyjj__vyc5g">
         <w:r>
           <w:rPr>
             <w:color w:val="1F3A5F"/>
@@ -150,6 +150,16 @@
       </w:r>
       <w:r>
         <w:rPr>
+          <w:b w:val="false"/>
+          <w:bCs w:val="false"/>
+        </w:rPr>
+        <w:t xml:space="preserve">T-SQL</w:t>
+      </w:r>
+      <w:r>
+        <w:t xml:space="preserve">, </w:t>
+      </w:r>
+      <w:r>
+        <w:rPr>
           <w:b/>
           <w:bCs/>
         </w:rPr>
@@ -975,6 +985,35 @@
           <w:bCs w:val="false"/>
         </w:rPr>
         <w:t xml:space="preserve">OpenNext</w:t>
+      </w:r>
+    </w:p>
+    <w:p>
+      <w:pPr>
+        <w:spacing w:after="20"/>
+      </w:pPr>
+      <w:r>
+        <w:rPr>
+          <w:b/>
+          <w:bCs/>
+        </w:rPr>
+        <w:t xml:space="preserve">Identity: </w:t>
+      </w:r>
+      <w:r>
+        <w:rPr>
+          <w:b w:val="false"/>
+          <w:bCs w:val="false"/>
+        </w:rPr>
+        <w:t xml:space="preserve">PingOne</w:t>
+      </w:r>
+      <w:r>
+        <w:t xml:space="preserve">, </w:t>
+      </w:r>
+      <w:r>
+        <w:rPr>
+          <w:b w:val="false"/>
+          <w:bCs w:val="false"/>
+        </w:rPr>
+        <w:t xml:space="preserve">Active Directory / LDAP</w:t>
       </w:r>
     </w:p>
     <w:p>
@@ -1207,7 +1246,7 @@
         <w:spacing w:after="20"/>
       </w:pPr>
       <w:r>
-        <w:t xml:space="preserve">Technical delivery lead for a data engineering engagement (SQL Server, Databricks, dbt), including project management and coaching.</w:t>
+        <w:t xml:space="preserve">Technical delivery lead for a regional mutual insurer's data engineering engagement (SQL Server, T-SQL, Databricks, dbt), including project management and coaching.</w:t>
       </w:r>
     </w:p>
     <w:p>
@@ -1220,7 +1259,7 @@
         <w:spacing w:after="20"/>
       </w:pPr>
       <w:r>
-        <w:t xml:space="preserve">Led English/French internationalization of a client's customer portal and outgoing email (Vue I18n, Thymeleaf, Spring Boot).</w:t>
+        <w:t xml:space="preserve">Led English/French internationalization of a roofing-materials manufacturer's customer portal and outgoing email for the US and Canada (Vue I18n, Thymeleaf, Spring Boot).</w:t>
       </w:r>
     </w:p>
     <w:p>
@@ -1246,7 +1285,7 @@
         <w:spacing w:after="20"/>
       </w:pPr>
       <w:r>
-        <w:t xml:space="preserve">Reworked the frontend of a high-traffic identity-management application.</w:t>
+        <w:t xml:space="preserve">Redesigning a federally backed bank's high-traffic web application, which handles all of its money intake: reworked the frontend, built its first public API and secured it, and moved identity to PingOne, migrating Active Directory and LDAP users.</w:t>
       </w:r>
     </w:p>
     <w:p>
@@ -1259,6 +1298,19 @@
         <w:spacing w:after="20"/>
       </w:pPr>
       <w:r>
+        <w:t xml:space="preserve">Helped design a digital-identity company's webinar platform in Figma.</w:t>
+      </w:r>
+    </w:p>
+    <w:p>
+      <w:pPr>
+        <w:pStyle w:val="ListParagraph"/>
+        <w:numPr>
+          <w:ilvl w:val="0"/>
+          <w:numId w:val="2"/>
+        </w:numPr>
+        <w:spacing w:after="20"/>
+      </w:pPr>
+      <w:r>
         <w:t xml:space="preserve">Mentor and teach the company's apprentices.</w:t>
       </w:r>
     </w:p>
@@ -1281,7 +1333,7 @@
           <w:sz w:val="18"/>
           <w:szCs w:val="18"/>
         </w:rPr>
-        <w:t xml:space="preserve">Vue.js, React, Java, Spring Boot, GraphQL, C#, TypeScript, Python, Node.js, AWS Bedrock, Azure, SQL Server, Databricks, dbt</w:t>
+        <w:t xml:space="preserve">Vue.js, React, Java, Spring Boot, GraphQL, C#, TypeScript, Python, Node.js, AWS Bedrock, Azure, SQL Server, T-SQL, Databricks, dbt, PingOne, Active Directory / LDAP, Figma</w:t>
       </w:r>
     </w:p>
     <w:p>
@@ -1668,7 +1720,7 @@
         <w:spacing w:after="40" w:before="0"/>
       </w:pPr>
       <w:r>
-        <w:t xml:space="preserve">Built full-stack features for a homegrown ERP system with Angular, RxJS, .NET, and SQL Server on Azure, using ASP.NET Boilerplate, PrimeNG, and Bootstrap.</w:t>
+        <w:t xml:space="preserve">Built full-stack features for a homegrown ERP system with Angular, RxJS, .NET, and SQL Server on Azure, using ASP.NET Boilerplate, PrimeNG, and Bootstrap, and upgraded the company's internal .NET applications.</w:t>
       </w:r>
     </w:p>
     <w:p>

</xml_diff>

<commit_message>
Resume: T-SQL is an alias of SQL, not its own skill
Co-Authored-By: Claude Opus 5.5 <noreply@anthropic.com>
</commit_message>
<xml_diff>
--- a/apps/web/public/downloads/base/Ryan Jensen - Resume.docx
+++ b/apps/web/public/downloads/base/Ryan Jensen - Resume.docx
@@ -53,7 +53,7 @@
         </w:rPr>
         <w:t xml:space="preserve"> · </w:t>
       </w:r>
-      <w:hyperlink w:history="1" r:id="rIdhwiucroj2tgfv1qcx8uvx">
+      <w:hyperlink w:history="1" r:id="rId6rywymem4dhvltlpwk0jm">
         <w:r>
           <w:rPr>
             <w:color w:val="1F3A5F"/>
@@ -67,7 +67,7 @@
         </w:rPr>
         <w:t xml:space="preserve"> · </w:t>
       </w:r>
-      <w:hyperlink w:history="1" r:id="rId1-2lvjzzivomjtfu1acir">
+      <w:hyperlink w:history="1" r:id="rIdqnlwiuzs2g_ll2ppfrgtr">
         <w:r>
           <w:rPr>
             <w:color w:val="1F3A5F"/>
@@ -81,7 +81,7 @@
         </w:rPr>
         <w:t xml:space="preserve"> · </w:t>
       </w:r>
-      <w:hyperlink w:history="1" r:id="rIdxq6qshavz3grjjqov-5oy">
+      <w:hyperlink w:history="1" r:id="rIddmxhotdo-gmaxszc4epn5">
         <w:r>
           <w:rPr>
             <w:color w:val="1F3A5F"/>
@@ -150,16 +150,6 @@
       </w:r>
       <w:r>
         <w:rPr>
-          <w:b w:val="false"/>
-          <w:bCs w:val="false"/>
-        </w:rPr>
-        <w:t xml:space="preserve">T-SQL</w:t>
-      </w:r>
-      <w:r>
-        <w:t xml:space="preserve">, </w:t>
-      </w:r>
-      <w:r>
-        <w:rPr>
           <w:b/>
           <w:bCs/>
         </w:rPr>
@@ -1333,7 +1323,7 @@
           <w:sz w:val="18"/>
           <w:szCs w:val="18"/>
         </w:rPr>
-        <w:t xml:space="preserve">Vue.js, React, Java, Spring Boot, GraphQL, C#, TypeScript, Python, Node.js, AWS Bedrock, Azure, SQL Server, T-SQL, Databricks, dbt, PingOne, Active Directory / LDAP, Figma</w:t>
+        <w:t xml:space="preserve">Vue.js, React, Java, Spring Boot, GraphQL, C#, TypeScript, Python, Node.js, AWS Bedrock, Azure, SQL Server, Databricks, dbt, PingOne, Active Directory / LDAP, Figma</w:t>
       </w:r>
     </w:p>
     <w:p>

</xml_diff>

<commit_message>
Admin: real D1 database_id
Co-Authored-By: Claude Opus 5.5 <noreply@anthropic.com>
</commit_message>
<xml_diff>
--- a/apps/web/public/downloads/base/Ryan Jensen - Resume.docx
+++ b/apps/web/public/downloads/base/Ryan Jensen - Resume.docx
@@ -53,7 +53,7 @@
         </w:rPr>
         <w:t xml:space="preserve"> · </w:t>
       </w:r>
-      <w:hyperlink w:history="1" r:id="rId6rywymem4dhvltlpwk0jm">
+      <w:hyperlink w:history="1" r:id="rIddjzsvm5drxjxnfw10tf2p">
         <w:r>
           <w:rPr>
             <w:color w:val="1F3A5F"/>
@@ -67,7 +67,7 @@
         </w:rPr>
         <w:t xml:space="preserve"> · </w:t>
       </w:r>
-      <w:hyperlink w:history="1" r:id="rIdqnlwiuzs2g_ll2ppfrgtr">
+      <w:hyperlink w:history="1" r:id="rId7-aa71sckwyofqh9hvgtf">
         <w:r>
           <w:rPr>
             <w:color w:val="1F3A5F"/>
@@ -81,7 +81,7 @@
         </w:rPr>
         <w:t xml:space="preserve"> · </w:t>
       </w:r>
-      <w:hyperlink w:history="1" r:id="rIddmxhotdo-gmaxszc4epn5">
+      <w:hyperlink w:history="1" r:id="rIdebobrw0pyxmfcy2iyrmwp">
         <w:r>
           <w:rPr>
             <w:color w:val="1F3A5F"/>

</xml_diff>

<commit_message>
Use hello@ryanjensen.dev as the public contact address
basics.email in data/resume.yaml, with resume.json and every download rebuilt.

Co-Authored-By: Claude Opus 5.5 <noreply@anthropic.com>
</commit_message>
<xml_diff>
--- a/apps/web/public/downloads/base/Ryan Jensen - Resume.docx
+++ b/apps/web/public/downloads/base/Ryan Jensen - Resume.docx
@@ -36,7 +36,7 @@
         <w:spacing w:after="120"/>
       </w:pPr>
       <w:r>
-        <w:t xml:space="preserve">ryan@rjrjensen.com</w:t>
+        <w:t xml:space="preserve">hello@ryanjensen.dev</w:t>
       </w:r>
       <w:r>
         <w:rPr>
@@ -53,7 +53,7 @@
         </w:rPr>
         <w:t xml:space="preserve"> · </w:t>
       </w:r>
-      <w:hyperlink w:history="1" r:id="rIdzi_u5wdtpvnfikqux4wkv">
+      <w:hyperlink w:history="1" r:id="rIdjc5y4xhuaxkidjowgodkw">
         <w:r>
           <w:rPr>
             <w:color w:val="1F3A5F"/>
@@ -67,7 +67,7 @@
         </w:rPr>
         <w:t xml:space="preserve"> · </w:t>
       </w:r>
-      <w:hyperlink w:history="1" r:id="rIdpwsni-9svjhttjtgsju1l">
+      <w:hyperlink w:history="1" r:id="rIdizkn6n9ehcth0-ovaszsd">
         <w:r>
           <w:rPr>
             <w:color w:val="1F3A5F"/>
@@ -81,7 +81,7 @@
         </w:rPr>
         <w:t xml:space="preserve"> · </w:t>
       </w:r>
-      <w:hyperlink w:history="1" r:id="rIdycsfelw5i1zolq3qkfxys">
+      <w:hyperlink w:history="1" r:id="rIdafezk2hhjwj8i6kbavmn1">
         <w:r>
           <w:rPr>
             <w:color w:val="1F3A5F"/>

</xml_diff>

<commit_message>
Regenerate downloads from data/resume.yaml
</commit_message>
<xml_diff>
--- a/apps/web/public/downloads/base/Ryan Jensen - Resume.docx
+++ b/apps/web/public/downloads/base/Ryan Jensen - Resume.docx
@@ -53,7 +53,7 @@
         </w:rPr>
         <w:t xml:space="preserve"> · </w:t>
       </w:r>
-      <w:hyperlink w:history="1" r:id="rIddjzsvm5drxjxnfw10tf2p">
+      <w:hyperlink w:history="1" r:id="rIdk0bz-4mtu1sha1k9cuubz">
         <w:r>
           <w:rPr>
             <w:color w:val="1F3A5F"/>
@@ -67,7 +67,7 @@
         </w:rPr>
         <w:t xml:space="preserve"> · </w:t>
       </w:r>
-      <w:hyperlink w:history="1" r:id="rId7-aa71sckwyofqh9hvgtf">
+      <w:hyperlink w:history="1" r:id="rId2gwetbyk8r9vesjgrctsv">
         <w:r>
           <w:rPr>
             <w:color w:val="1F3A5F"/>
@@ -81,7 +81,7 @@
         </w:rPr>
         <w:t xml:space="preserve"> · </w:t>
       </w:r>
-      <w:hyperlink w:history="1" r:id="rIdebobrw0pyxmfcy2iyrmwp">
+      <w:hyperlink w:history="1" r:id="rIdhgcjd_imdpbnoyq5eta7h">
         <w:r>
           <w:rPr>
             <w:color w:val="1F3A5F"/>
@@ -798,6 +798,26 @@
         </w:rPr>
         <w:t xml:space="preserve">Gherkin</w:t>
       </w:r>
+      <w:r>
+        <w:t xml:space="preserve">, </w:t>
+      </w:r>
+      <w:r>
+        <w:rPr>
+          <w:b w:val="false"/>
+          <w:bCs w:val="false"/>
+        </w:rPr>
+        <w:t xml:space="preserve">Production software engineering</w:t>
+      </w:r>
+      <w:r>
+        <w:t xml:space="preserve">, </w:t>
+      </w:r>
+      <w:r>
+        <w:rPr>
+          <w:b w:val="false"/>
+          <w:bCs w:val="false"/>
+        </w:rPr>
+        <w:t xml:space="preserve">LLM evaluation</w:t>
+      </w:r>
     </w:p>
     <w:p>
       <w:pPr>
@@ -877,6 +897,16 @@
         </w:rPr>
         <w:t xml:space="preserve">Figma</w:t>
       </w:r>
+      <w:r>
+        <w:t xml:space="preserve">, </w:t>
+      </w:r>
+      <w:r>
+        <w:rPr>
+          <w:b w:val="false"/>
+          <w:bCs w:val="false"/>
+        </w:rPr>
+        <w:t xml:space="preserve">Payment scheduling and processing</w:t>
+      </w:r>
     </w:p>
     <w:p>
       <w:pPr>
@@ -1064,6 +1094,26 @@
         </w:rPr>
         <w:t xml:space="preserve">GitHub Projects</w:t>
       </w:r>
+      <w:r>
+        <w:t xml:space="preserve">, </w:t>
+      </w:r>
+      <w:r>
+        <w:rPr>
+          <w:b w:val="false"/>
+          <w:bCs w:val="false"/>
+        </w:rPr>
+        <w:t xml:space="preserve">Estimation and proofs of concept</w:t>
+      </w:r>
+      <w:r>
+        <w:t xml:space="preserve">, </w:t>
+      </w:r>
+      <w:r>
+        <w:rPr>
+          <w:b w:val="false"/>
+          <w:bCs w:val="false"/>
+        </w:rPr>
+        <w:t xml:space="preserve">Vendor partnership</w:t>
+      </w:r>
     </w:p>
     <w:p>
       <w:pPr>
@@ -1122,6 +1172,26 @@
           <w:bCs w:val="false"/>
         </w:rPr>
         <w:t xml:space="preserve">Technology strategy &amp; budgeting</w:t>
+      </w:r>
+      <w:r>
+        <w:t xml:space="preserve">, </w:t>
+      </w:r>
+      <w:r>
+        <w:rPr>
+          <w:b w:val="false"/>
+          <w:bCs w:val="false"/>
+        </w:rPr>
+        <w:t xml:space="preserve">Written communication</w:t>
+      </w:r>
+      <w:r>
+        <w:t xml:space="preserve">, </w:t>
+      </w:r>
+      <w:r>
+        <w:rPr>
+          <w:b w:val="false"/>
+          <w:bCs w:val="false"/>
+        </w:rPr>
+        <w:t xml:space="preserve">Time management in changing priorities</w:t>
       </w:r>
     </w:p>
     <w:p>
@@ -1323,7 +1393,7 @@
           <w:sz w:val="18"/>
           <w:szCs w:val="18"/>
         </w:rPr>
-        <w:t xml:space="preserve">Vue.js, React, Java, Spring Boot, GraphQL, C#, TypeScript, Python, Node.js, AWS Bedrock, Azure, SQL Server, Databricks, dbt, PingOne, Active Directory / LDAP, Figma</w:t>
+        <w:t xml:space="preserve">Vue.js, React, Java, Spring Boot, GraphQL, C#, TypeScript, Python, Node.js, AWS Bedrock, Azure, SQL Server, Databricks, dbt, PingOne, Active Directory / LDAP, Figma, LLM evaluation, Written communication, Time management in changing priorities, Estimation and proofs of concept, Agile</w:t>
       </w:r>
     </w:p>
     <w:p>
@@ -1439,7 +1509,7 @@
           <w:sz w:val="18"/>
           <w:szCs w:val="18"/>
         </w:rPr>
-        <w:t xml:space="preserve">.NET Framework 4.5 → .NET 10, AngularJS → Next.js, SQL Server → PostgreSQL, EC2 → CloudFront + Lambda + OpenNext, SQL Jobs → Linux (crontab), Terraform</w:t>
+        <w:t xml:space="preserve">.NET Framework 4.5 → .NET 10, AngularJS → Next.js, SQL Server → PostgreSQL, EC2 → CloudFront + Lambda + OpenNext, SQL Jobs → Linux (crontab), Terraform, Production software engineering, Vendor partnership</w:t>
       </w:r>
     </w:p>
     <w:p>

</xml_diff>